<commit_message>
[LOG] Started to work on: "Pflichtenheft"
</commit_message>
<xml_diff>
--- a/0_Documents/Projektauftrag.docx
+++ b/0_Documents/Projektauftrag.docx
@@ -1481,6 +1481,28 @@
                 <w:szCs w:val="20"/>
               </w:rPr>
               <w:t>Zeitaufwand zu groß. Deadline könnte krachen</w:t>
+            </w:r>
+          </w:p>
+          <w:p>
+            <w:pPr>
+              <w:pStyle w:val="Aufzhlungszeichen"/>
+              <w:numPr>
+                <w:ilvl w:val="0"/>
+                <w:numId w:val="2"/>
+              </w:numPr>
+              <w:rPr>
+                <w:rFonts w:asciiTheme="majorHAnsi" w:hAnsiTheme="majorHAnsi"/>
+                <w:sz w:val="20"/>
+                <w:szCs w:val="20"/>
+              </w:rPr>
+            </w:pPr>
+            <w:r>
+              <w:rPr>
+                <w:rFonts w:asciiTheme="majorHAnsi" w:hAnsiTheme="majorHAnsi"/>
+                <w:sz w:val="20"/>
+                <w:szCs w:val="20"/>
+              </w:rPr>
+              <w:t>Krankheitsfall</w:t>
             </w:r>
           </w:p>
         </w:tc>
@@ -3171,6 +3193,7 @@
                 <w:sz w:val="20"/>
                 <w:szCs w:val="20"/>
               </w:rPr>
+              <w:lastRenderedPageBreak/>
               <w:t>Sonstige Angaben</w:t>
             </w:r>
           </w:p>
@@ -3257,7 +3280,6 @@
                 <w:sz w:val="20"/>
                 <w:szCs w:val="20"/>
               </w:rPr>
-              <w:lastRenderedPageBreak/>
               <w:t>Freigabe</w:t>
             </w:r>
           </w:p>

</xml_diff>

<commit_message>
[LOG] Updated documents: Pflichtenheft & Projekthandbuch
</commit_message>
<xml_diff>
--- a/0_Documents/Projektauftrag.docx
+++ b/0_Documents/Projektauftrag.docx
@@ -358,7 +358,6 @@
               </w:rPr>
               <w:t xml:space="preserve">Multi </w:t>
             </w:r>
-            <w:proofErr w:type="spellStart"/>
             <w:r>
               <w:rPr>
                 <w:rFonts w:asciiTheme="majorHAnsi" w:hAnsiTheme="majorHAnsi"/>
@@ -373,16 +372,7 @@
                 <w:sz w:val="20"/>
                 <w:szCs w:val="20"/>
               </w:rPr>
-              <w:t>ser</w:t>
-            </w:r>
-            <w:proofErr w:type="spellEnd"/>
-            <w:r>
-              <w:rPr>
-                <w:rFonts w:asciiTheme="majorHAnsi" w:hAnsiTheme="majorHAnsi"/>
-                <w:sz w:val="20"/>
-                <w:szCs w:val="20"/>
-              </w:rPr>
-              <w:t xml:space="preserve"> </w:t>
+              <w:t xml:space="preserve">ser </w:t>
             </w:r>
             <w:r>
               <w:rPr>
@@ -406,35 +396,16 @@
                 <w:sz w:val="20"/>
                 <w:szCs w:val="20"/>
               </w:rPr>
-              <w:t>-</w:t>
-            </w:r>
-            <w:proofErr w:type="spellStart"/>
-            <w:r>
-              <w:rPr>
-                <w:rFonts w:asciiTheme="majorHAnsi" w:hAnsiTheme="majorHAnsi"/>
-                <w:sz w:val="20"/>
-                <w:szCs w:val="20"/>
-              </w:rPr>
-              <w:t>h</w:t>
-            </w:r>
-            <w:r>
-              <w:rPr>
-                <w:rFonts w:asciiTheme="majorHAnsi" w:hAnsiTheme="majorHAnsi"/>
-                <w:sz w:val="20"/>
-                <w:szCs w:val="20"/>
-              </w:rPr>
-              <w:t>osted</w:t>
-            </w:r>
-            <w:proofErr w:type="spellEnd"/>
-            <w:r>
-              <w:rPr>
-                <w:rFonts w:asciiTheme="majorHAnsi" w:hAnsiTheme="majorHAnsi"/>
-                <w:sz w:val="20"/>
-                <w:szCs w:val="20"/>
-              </w:rPr>
-              <w:t xml:space="preserve"> </w:t>
-            </w:r>
-            <w:proofErr w:type="spellStart"/>
+              <w:t>-h</w:t>
+            </w:r>
+            <w:r>
+              <w:rPr>
+                <w:rFonts w:asciiTheme="majorHAnsi" w:hAnsiTheme="majorHAnsi"/>
+                <w:sz w:val="20"/>
+                <w:szCs w:val="20"/>
+              </w:rPr>
+              <w:t xml:space="preserve">osted </w:t>
+            </w:r>
             <w:r>
               <w:rPr>
                 <w:rFonts w:asciiTheme="majorHAnsi" w:hAnsiTheme="majorHAnsi"/>
@@ -451,7 +422,6 @@
               </w:rPr>
               <w:t>pp</w:t>
             </w:r>
-            <w:proofErr w:type="spellEnd"/>
           </w:p>
         </w:tc>
       </w:tr>
@@ -2856,18 +2826,8 @@
                 <w:sz w:val="20"/>
                 <w:szCs w:val="20"/>
               </w:rPr>
-              <w:t xml:space="preserve">Hook auf Microsoft </w:t>
-            </w:r>
-            <w:proofErr w:type="spellStart"/>
-            <w:r>
-              <w:rPr>
-                <w:rFonts w:asciiTheme="majorHAnsi" w:hAnsiTheme="majorHAnsi"/>
-                <w:sz w:val="20"/>
-                <w:szCs w:val="20"/>
-              </w:rPr>
-              <w:t>SingalR</w:t>
-            </w:r>
-            <w:proofErr w:type="spellEnd"/>
+              <w:t>Hook auf Microsoft SingalR</w:t>
+            </w:r>
           </w:p>
         </w:tc>
         <w:tc>
@@ -3037,6 +2997,14 @@
                 <w:szCs w:val="20"/>
               </w:rPr>
             </w:pPr>
+            <w:r>
+              <w:rPr>
+                <w:rFonts w:asciiTheme="majorHAnsi" w:hAnsiTheme="majorHAnsi"/>
+                <w:sz w:val="20"/>
+                <w:szCs w:val="20"/>
+              </w:rPr>
+              <w:t>Keine</w:t>
+            </w:r>
           </w:p>
         </w:tc>
       </w:tr>

</xml_diff>